<commit_message>
feat(ui): unificar tabla de pagos en gerente, remover cheque y fijar botones de modal con scroll sticky
</commit_message>
<xml_diff>
--- a/docs/entregable_completo_mvp.docx
+++ b/docs/entregable_completo_mvp.docx
@@ -822,7 +822,7 @@
           <w:color w:val="D97706"/>
           <w:sz w:val="17"/>
         </w:rPr>
-        <w:t xml:space="preserve">Criterio 2.2 (Vista Conjunta en la Misma Pantalla): </w:t>
+        <w:t xml:space="preserve">Criterio 2.2 (Vista Unificada en la Misma Pantalla): </w:t>
       </w:r>
       <w:r>
         <w:rPr>
@@ -830,11 +830,11 @@
           <w:color w:val="1F2937"/>
           <w:sz w:val="17"/>
         </w:rPr>
-        <w:t>Dado que existen gastos registrados,</w:t>
+        <w:t>Dado que existen compromisos financieros registrados en el mes,</w:t>
         <w:br/>
         <w:t>Cuando el Gerente revisa su panel,</w:t>
         <w:br/>
-        <w:t>Entonces visualiza simultáneamente en la misma pantalla la tabla de 'Pagos Pendientes del Periodo' y la tabla de 'Pagos Realizados del Periodo', sin pestañas intermedias.</w:t>
+        <w:t>Entonces visualiza todas las obligaciones y pagos del periodo consolidados en una sola tabla unificada ('Obligaciones y Pagos del Periodo'), con el estado (Pendiente o Realizado) indicado claramente a la derecha, sin dividirlas en tablas separadas ni pestañas intermedias.</w:t>
       </w:r>
     </w:p>
     <w:p>
@@ -992,7 +992,7 @@
           <w:color w:val="1F2937"/>
           <w:sz w:val="17"/>
         </w:rPr>
-        <w:t>Construir tablas sincronizadas en el DOM para renderizar pagos pendientes y realizados juntos.</w:t>
+        <w:t>Construir tabla consolidada en el DOM para renderizar todas las obligaciones y pagos del periodo.</w:t>
       </w:r>
     </w:p>
     <w:p>
@@ -3237,7 +3237,7 @@
                 <w:color w:val="1F2937"/>
                 <w:sz w:val="16"/>
               </w:rPr>
-              <w:t>Construir tablas sincronizadas en el DOM para renderizar pagos pendientes y realizados juntos</w:t>
+              <w:t>Construir tabla consolidada en el DOM para renderizar todas las obligaciones y pagos del periodo</w:t>
             </w:r>
           </w:p>
         </w:tc>
@@ -7615,7 +7615,7 @@
           <w:color w:val="1E3A5F"/>
           <w:sz w:val="23"/>
         </w:rPr>
-        <w:t>Dashboard del Gerente con 4 KPIs y Pantalla Unificada (HU-01, HU-02, Criterios 1.3, 2.1, 2.2)</w:t>
+        <w:t>Dashboard del Gerente con 4 KPIs y Tabla Única Consolidada (HU-01, HU-02, Criterios 1.3, 2.1, 2.2)</w:t>
       </w:r>
     </w:p>
     <w:p>
@@ -7660,7 +7660,7 @@
         <w:br/>
         <w:t>4) Próximo Vencimiento: 18/10/2026 (Recibo de Energía Eléctrica).</w:t>
         <w:br/>
-        <w:t>Debajo, en la misma pantalla, se despliegan juntas las tablas de pendientes y realizados.</w:t>
+        <w:t>Debajo, en la misma ventana, se consolidan todas las obligaciones y pagos en una sola tabla unificada, mostrando a la derecha el estado ('Pendiente' o 'Realizado') con sus respectivos comprobantes y titularidad.</w:t>
       </w:r>
     </w:p>
     <w:p>
@@ -7671,7 +7671,7 @@
       <w:r>
         <w:drawing>
           <wp:inline xmlns:a="http://schemas.openxmlformats.org/drawingml/2006/main" xmlns:pic="http://schemas.openxmlformats.org/drawingml/2006/picture">
-            <wp:extent cx="5212080" cy="6177129"/>
+            <wp:extent cx="5212080" cy="5541907"/>
             <wp:docPr id="3" name="Picture 3"/>
             <wp:cNvGraphicFramePr>
               <a:graphicFrameLocks noChangeAspect="1"/>
@@ -7692,7 +7692,7 @@
                   <pic:spPr>
                     <a:xfrm>
                       <a:off x="0" y="0"/>
-                      <a:ext cx="5212080" cy="6177129"/>
+                      <a:ext cx="5212080" cy="5541907"/>
                     </a:xfrm>
                     <a:prstGeom prst="rect"/>
                   </pic:spPr>
@@ -7737,7 +7737,7 @@
           <w:color w:val="0F5132"/>
           <w:sz w:val="17"/>
         </w:rPr>
-        <w:t>Cumple Criterios 2.1 y 2.2: 4 KPIs consolidados y visualización conjunta de listas en la misma pantalla.</w:t>
+        <w:t>Cumple Criterios 2.1 y 2.2: 4 KPIs consolidados y visualización unificada en una sola tabla sin divisiones innecesarias.</w:t>
       </w:r>
     </w:p>
     <w:p>
@@ -7806,7 +7806,7 @@
       <w:r>
         <w:drawing>
           <wp:inline xmlns:a="http://schemas.openxmlformats.org/drawingml/2006/main" xmlns:pic="http://schemas.openxmlformats.org/drawingml/2006/picture">
-            <wp:extent cx="5212080" cy="5020699"/>
+            <wp:extent cx="5212080" cy="4299966"/>
             <wp:docPr id="4" name="Picture 4"/>
             <wp:cNvGraphicFramePr>
               <a:graphicFrameLocks noChangeAspect="1"/>
@@ -7827,7 +7827,7 @@
                   <pic:spPr>
                     <a:xfrm>
                       <a:off x="0" y="0"/>
-                      <a:ext cx="5212080" cy="5020699"/>
+                      <a:ext cx="5212080" cy="4299966"/>
                     </a:xfrm>
                     <a:prstGeom prst="rect"/>
                   </pic:spPr>
@@ -7941,7 +7941,7 @@
       <w:r>
         <w:drawing>
           <wp:inline xmlns:a="http://schemas.openxmlformats.org/drawingml/2006/main" xmlns:pic="http://schemas.openxmlformats.org/drawingml/2006/picture">
-            <wp:extent cx="5212080" cy="5297590"/>
+            <wp:extent cx="5212080" cy="4299966"/>
             <wp:docPr id="5" name="Picture 5"/>
             <wp:cNvGraphicFramePr>
               <a:graphicFrameLocks noChangeAspect="1"/>
@@ -7962,7 +7962,7 @@
                   <pic:spPr>
                     <a:xfrm>
                       <a:off x="0" y="0"/>
-                      <a:ext cx="5212080" cy="5297590"/>
+                      <a:ext cx="5212080" cy="4299966"/>
                     </a:xfrm>
                     <a:prstGeom prst="rect"/>
                   </pic:spPr>

</xml_diff>

<commit_message>
feat(store): enriquecer base de datos local analoga con mas datos, persistencia reactiva, toast y boton de reset demo
</commit_message>
<xml_diff>
--- a/docs/entregable_completo_mvp.docx
+++ b/docs/entregable_completo_mvp.docx
@@ -7671,7 +7671,7 @@
       <w:r>
         <w:drawing>
           <wp:inline xmlns:a="http://schemas.openxmlformats.org/drawingml/2006/main" xmlns:pic="http://schemas.openxmlformats.org/drawingml/2006/picture">
-            <wp:extent cx="5212080" cy="5541907"/>
+            <wp:extent cx="5212080" cy="7142178"/>
             <wp:docPr id="3" name="Picture 3"/>
             <wp:cNvGraphicFramePr>
               <a:graphicFrameLocks noChangeAspect="1"/>
@@ -7692,7 +7692,7 @@
                   <pic:spPr>
                     <a:xfrm>
                       <a:off x="0" y="0"/>
-                      <a:ext cx="5212080" cy="5541907"/>
+                      <a:ext cx="5212080" cy="7142178"/>
                     </a:xfrm>
                     <a:prstGeom prst="rect"/>
                   </pic:spPr>
@@ -7806,7 +7806,7 @@
       <w:r>
         <w:drawing>
           <wp:inline xmlns:a="http://schemas.openxmlformats.org/drawingml/2006/main" xmlns:pic="http://schemas.openxmlformats.org/drawingml/2006/picture">
-            <wp:extent cx="5212080" cy="4299966"/>
+            <wp:extent cx="5212080" cy="5541907"/>
             <wp:docPr id="4" name="Picture 4"/>
             <wp:cNvGraphicFramePr>
               <a:graphicFrameLocks noChangeAspect="1"/>
@@ -7827,7 +7827,7 @@
                   <pic:spPr>
                     <a:xfrm>
                       <a:off x="0" y="0"/>
-                      <a:ext cx="5212080" cy="4299966"/>
+                      <a:ext cx="5212080" cy="5541907"/>
                     </a:xfrm>
                     <a:prstGeom prst="rect"/>
                   </pic:spPr>
@@ -7941,7 +7941,7 @@
       <w:r>
         <w:drawing>
           <wp:inline xmlns:a="http://schemas.openxmlformats.org/drawingml/2006/main" xmlns:pic="http://schemas.openxmlformats.org/drawingml/2006/picture">
-            <wp:extent cx="5212080" cy="4299966"/>
+            <wp:extent cx="5212080" cy="5607058"/>
             <wp:docPr id="5" name="Picture 5"/>
             <wp:cNvGraphicFramePr>
               <a:graphicFrameLocks noChangeAspect="1"/>
@@ -7962,7 +7962,7 @@
                   <pic:spPr>
                     <a:xfrm>
                       <a:off x="0" y="0"/>
-                      <a:ext cx="5212080" cy="4299966"/>
+                      <a:ext cx="5212080" cy="5607058"/>
                     </a:xfrm>
                     <a:prstGeom prst="rect"/>
                   </pic:spPr>
@@ -8751,7 +8751,7 @@
       <w:r>
         <w:drawing>
           <wp:inline xmlns:a="http://schemas.openxmlformats.org/drawingml/2006/main" xmlns:pic="http://schemas.openxmlformats.org/drawingml/2006/picture">
-            <wp:extent cx="5212080" cy="4914829"/>
+            <wp:extent cx="5212080" cy="8461486"/>
             <wp:docPr id="11" name="Picture 11"/>
             <wp:cNvGraphicFramePr>
               <a:graphicFrameLocks noChangeAspect="1"/>
@@ -8772,7 +8772,7 @@
                   <pic:spPr>
                     <a:xfrm>
                       <a:off x="0" y="0"/>
-                      <a:ext cx="5212080" cy="4914829"/>
+                      <a:ext cx="5212080" cy="8461486"/>
                     </a:xfrm>
                     <a:prstGeom prst="rect"/>
                   </pic:spPr>
@@ -9299,7 +9299,7 @@
       <w:r>
         <w:drawing>
           <wp:inline xmlns:a="http://schemas.openxmlformats.org/drawingml/2006/main" xmlns:pic="http://schemas.openxmlformats.org/drawingml/2006/picture">
-            <wp:extent cx="5212080" cy="6071259"/>
+            <wp:extent cx="5212080" cy="8461486"/>
             <wp:docPr id="15" name="Picture 15"/>
             <wp:cNvGraphicFramePr>
               <a:graphicFrameLocks noChangeAspect="1"/>
@@ -9320,7 +9320,7 @@
                   <pic:spPr>
                     <a:xfrm>
                       <a:off x="0" y="0"/>
-                      <a:ext cx="5212080" cy="6071259"/>
+                      <a:ext cx="5212080" cy="8461486"/>
                     </a:xfrm>
                     <a:prstGeom prst="rect"/>
                   </pic:spPr>

</xml_diff>

<commit_message>
feat(presentation): ocultar caja de credenciales, inicializar base de datos limpia para exposicion y agregar modo presentacion discreto con Ctrl+Shift+D
</commit_message>
<xml_diff>
--- a/docs/entregable_completo_mvp.docx
+++ b/docs/entregable_completo_mvp.docx
@@ -7671,7 +7671,7 @@
       <w:r>
         <w:drawing>
           <wp:inline xmlns:a="http://schemas.openxmlformats.org/drawingml/2006/main" xmlns:pic="http://schemas.openxmlformats.org/drawingml/2006/picture">
-            <wp:extent cx="5212080" cy="7142178"/>
+            <wp:extent cx="5212080" cy="3909060"/>
             <wp:docPr id="3" name="Picture 3"/>
             <wp:cNvGraphicFramePr>
               <a:graphicFrameLocks noChangeAspect="1"/>
@@ -7692,7 +7692,7 @@
                   <pic:spPr>
                     <a:xfrm>
                       <a:off x="0" y="0"/>
-                      <a:ext cx="5212080" cy="7142178"/>
+                      <a:ext cx="5212080" cy="3909060"/>
                     </a:xfrm>
                     <a:prstGeom prst="rect"/>
                   </pic:spPr>
@@ -7806,7 +7806,7 @@
       <w:r>
         <w:drawing>
           <wp:inline xmlns:a="http://schemas.openxmlformats.org/drawingml/2006/main" xmlns:pic="http://schemas.openxmlformats.org/drawingml/2006/picture">
-            <wp:extent cx="5212080" cy="5541907"/>
+            <wp:extent cx="5212080" cy="3909060"/>
             <wp:docPr id="4" name="Picture 4"/>
             <wp:cNvGraphicFramePr>
               <a:graphicFrameLocks noChangeAspect="1"/>
@@ -7815,11 +7815,11 @@
               <a:graphicData uri="http://schemas.openxmlformats.org/drawingml/2006/picture">
                 <pic:pic>
                   <pic:nvPicPr>
-                    <pic:cNvPr id="0" name="04_gerente_mes_anterior_septiembre.png"/>
+                    <pic:cNvPr id="0" name="03_gerente_dashboard_octubre.png"/>
                     <pic:cNvPicPr/>
                   </pic:nvPicPr>
                   <pic:blipFill>
-                    <a:blip r:embed="rId12"/>
+                    <a:blip r:embed="rId11"/>
                     <a:stretch>
                       <a:fillRect/>
                     </a:stretch>
@@ -7827,7 +7827,7 @@
                   <pic:spPr>
                     <a:xfrm>
                       <a:off x="0" y="0"/>
-                      <a:ext cx="5212080" cy="5541907"/>
+                      <a:ext cx="5212080" cy="3909060"/>
                     </a:xfrm>
                     <a:prstGeom prst="rect"/>
                   </pic:spPr>
@@ -7941,7 +7941,7 @@
       <w:r>
         <w:drawing>
           <wp:inline xmlns:a="http://schemas.openxmlformats.org/drawingml/2006/main" xmlns:pic="http://schemas.openxmlformats.org/drawingml/2006/picture">
-            <wp:extent cx="5212080" cy="5607058"/>
+            <wp:extent cx="5212080" cy="3909060"/>
             <wp:docPr id="5" name="Picture 5"/>
             <wp:cNvGraphicFramePr>
               <a:graphicFrameLocks noChangeAspect="1"/>
@@ -7950,11 +7950,11 @@
               <a:graphicData uri="http://schemas.openxmlformats.org/drawingml/2006/picture">
                 <pic:pic>
                   <pic:nvPicPr>
-                    <pic:cNvPr id="0" name="05_gerente_proximo_mes_noviembre.png"/>
+                    <pic:cNvPr id="0" name="03_gerente_dashboard_octubre.png"/>
                     <pic:cNvPicPr/>
                   </pic:nvPicPr>
                   <pic:blipFill>
-                    <a:blip r:embed="rId13"/>
+                    <a:blip r:embed="rId11"/>
                     <a:stretch>
                       <a:fillRect/>
                     </a:stretch>
@@ -7962,7 +7962,7 @@
                   <pic:spPr>
                     <a:xfrm>
                       <a:off x="0" y="0"/>
-                      <a:ext cx="5212080" cy="5607058"/>
+                      <a:ext cx="5212080" cy="3909060"/>
                     </a:xfrm>
                     <a:prstGeom prst="rect"/>
                   </pic:spPr>
@@ -8089,7 +8089,7 @@
                     <pic:cNvPicPr/>
                   </pic:nvPicPr>
                   <pic:blipFill>
-                    <a:blip r:embed="rId14"/>
+                    <a:blip r:embed="rId12"/>
                     <a:stretch>
                       <a:fillRect/>
                     </a:stretch>
@@ -8220,11 +8220,11 @@
               <a:graphicData uri="http://schemas.openxmlformats.org/drawingml/2006/picture">
                 <pic:pic>
                   <pic:nvPicPr>
-                    <pic:cNvPr id="0" name="07_cuentas_confidenciales_gerente.png"/>
+                    <pic:cNvPr id="0" name="03_gerente_dashboard_octubre.png"/>
                     <pic:cNvPicPr/>
                   </pic:nvPicPr>
                   <pic:blipFill>
-                    <a:blip r:embed="rId15"/>
+                    <a:blip r:embed="rId11"/>
                     <a:stretch>
                       <a:fillRect/>
                     </a:stretch>
@@ -8359,7 +8359,7 @@
                     <pic:cNvPicPr/>
                   </pic:nvPicPr>
                   <pic:blipFill>
-                    <a:blip r:embed="rId16"/>
+                    <a:blip r:embed="rId13"/>
                     <a:stretch>
                       <a:fillRect/>
                     </a:stretch>
@@ -8494,7 +8494,7 @@
                     <pic:cNvPicPr/>
                   </pic:nvPicPr>
                   <pic:blipFill>
-                    <a:blip r:embed="rId17"/>
+                    <a:blip r:embed="rId14"/>
                     <a:stretch>
                       <a:fillRect/>
                     </a:stretch>
@@ -8629,7 +8629,7 @@
                     <pic:cNvPicPr/>
                   </pic:nvPicPr>
                   <pic:blipFill>
-                    <a:blip r:embed="rId18"/>
+                    <a:blip r:embed="rId15"/>
                     <a:stretch>
                       <a:fillRect/>
                     </a:stretch>
@@ -8764,7 +8764,7 @@
                     <pic:cNvPicPr/>
                   </pic:nvPicPr>
                   <pic:blipFill>
-                    <a:blip r:embed="rId19"/>
+                    <a:blip r:embed="rId16"/>
                     <a:stretch>
                       <a:fillRect/>
                     </a:stretch>
@@ -8899,7 +8899,7 @@
                     <pic:cNvPicPr/>
                   </pic:nvPicPr>
                   <pic:blipFill>
-                    <a:blip r:embed="rId20"/>
+                    <a:blip r:embed="rId17"/>
                     <a:stretch>
                       <a:fillRect/>
                     </a:stretch>
@@ -9034,7 +9034,7 @@
                     <pic:cNvPicPr/>
                   </pic:nvPicPr>
                   <pic:blipFill>
-                    <a:blip r:embed="rId21"/>
+                    <a:blip r:embed="rId18"/>
                     <a:stretch>
                       <a:fillRect/>
                     </a:stretch>
@@ -9177,7 +9177,7 @@
                     <pic:cNvPicPr/>
                   </pic:nvPicPr>
                   <pic:blipFill>
-                    <a:blip r:embed="rId22"/>
+                    <a:blip r:embed="rId19"/>
                     <a:stretch>
                       <a:fillRect/>
                     </a:stretch>
@@ -9312,7 +9312,7 @@
                     <pic:cNvPicPr/>
                   </pic:nvPicPr>
                   <pic:blipFill>
-                    <a:blip r:embed="rId23"/>
+                    <a:blip r:embed="rId20"/>
                     <a:stretch>
                       <a:fillRect/>
                     </a:stretch>
@@ -9447,7 +9447,7 @@
                     <pic:cNvPicPr/>
                   </pic:nvPicPr>
                   <pic:blipFill>
-                    <a:blip r:embed="rId24"/>
+                    <a:blip r:embed="rId21"/>
                     <a:stretch>
                       <a:fillRect/>
                     </a:stretch>

</xml_diff>

<commit_message>
fix(evidencias): limpiar campos de login antes de tipear credenciales y regenerar capturas 03 a 05 del dashboard mensual
</commit_message>
<xml_diff>
--- a/docs/entregable_completo_mvp.docx
+++ b/docs/entregable_completo_mvp.docx
@@ -7671,7 +7671,7 @@
       <w:r>
         <w:drawing>
           <wp:inline xmlns:a="http://schemas.openxmlformats.org/drawingml/2006/main" xmlns:pic="http://schemas.openxmlformats.org/drawingml/2006/picture">
-            <wp:extent cx="5212080" cy="3909060"/>
+            <wp:extent cx="5212080" cy="7142178"/>
             <wp:docPr id="3" name="Picture 3"/>
             <wp:cNvGraphicFramePr>
               <a:graphicFrameLocks noChangeAspect="1"/>
@@ -7692,7 +7692,7 @@
                   <pic:spPr>
                     <a:xfrm>
                       <a:off x="0" y="0"/>
-                      <a:ext cx="5212080" cy="3909060"/>
+                      <a:ext cx="5212080" cy="7142178"/>
                     </a:xfrm>
                     <a:prstGeom prst="rect"/>
                   </pic:spPr>
@@ -7806,7 +7806,7 @@
       <w:r>
         <w:drawing>
           <wp:inline xmlns:a="http://schemas.openxmlformats.org/drawingml/2006/main" xmlns:pic="http://schemas.openxmlformats.org/drawingml/2006/picture">
-            <wp:extent cx="5212080" cy="3909060"/>
+            <wp:extent cx="5212080" cy="5541907"/>
             <wp:docPr id="4" name="Picture 4"/>
             <wp:cNvGraphicFramePr>
               <a:graphicFrameLocks noChangeAspect="1"/>
@@ -7815,11 +7815,11 @@
               <a:graphicData uri="http://schemas.openxmlformats.org/drawingml/2006/picture">
                 <pic:pic>
                   <pic:nvPicPr>
-                    <pic:cNvPr id="0" name="03_gerente_dashboard_octubre.png"/>
+                    <pic:cNvPr id="0" name="04_gerente_mes_anterior_septiembre.png"/>
                     <pic:cNvPicPr/>
                   </pic:nvPicPr>
                   <pic:blipFill>
-                    <a:blip r:embed="rId11"/>
+                    <a:blip r:embed="rId12"/>
                     <a:stretch>
                       <a:fillRect/>
                     </a:stretch>
@@ -7827,7 +7827,7 @@
                   <pic:spPr>
                     <a:xfrm>
                       <a:off x="0" y="0"/>
-                      <a:ext cx="5212080" cy="3909060"/>
+                      <a:ext cx="5212080" cy="5541907"/>
                     </a:xfrm>
                     <a:prstGeom prst="rect"/>
                   </pic:spPr>
@@ -7941,7 +7941,7 @@
       <w:r>
         <w:drawing>
           <wp:inline xmlns:a="http://schemas.openxmlformats.org/drawingml/2006/main" xmlns:pic="http://schemas.openxmlformats.org/drawingml/2006/picture">
-            <wp:extent cx="5212080" cy="3909060"/>
+            <wp:extent cx="5212080" cy="5607058"/>
             <wp:docPr id="5" name="Picture 5"/>
             <wp:cNvGraphicFramePr>
               <a:graphicFrameLocks noChangeAspect="1"/>
@@ -7950,11 +7950,11 @@
               <a:graphicData uri="http://schemas.openxmlformats.org/drawingml/2006/picture">
                 <pic:pic>
                   <pic:nvPicPr>
-                    <pic:cNvPr id="0" name="03_gerente_dashboard_octubre.png"/>
+                    <pic:cNvPr id="0" name="05_gerente_proximo_mes_noviembre.png"/>
                     <pic:cNvPicPr/>
                   </pic:nvPicPr>
                   <pic:blipFill>
-                    <a:blip r:embed="rId11"/>
+                    <a:blip r:embed="rId13"/>
                     <a:stretch>
                       <a:fillRect/>
                     </a:stretch>
@@ -7962,7 +7962,7 @@
                   <pic:spPr>
                     <a:xfrm>
                       <a:off x="0" y="0"/>
-                      <a:ext cx="5212080" cy="3909060"/>
+                      <a:ext cx="5212080" cy="5607058"/>
                     </a:xfrm>
                     <a:prstGeom prst="rect"/>
                   </pic:spPr>
@@ -8089,7 +8089,7 @@
                     <pic:cNvPicPr/>
                   </pic:nvPicPr>
                   <pic:blipFill>
-                    <a:blip r:embed="rId12"/>
+                    <a:blip r:embed="rId14"/>
                     <a:stretch>
                       <a:fillRect/>
                     </a:stretch>
@@ -8220,11 +8220,11 @@
               <a:graphicData uri="http://schemas.openxmlformats.org/drawingml/2006/picture">
                 <pic:pic>
                   <pic:nvPicPr>
-                    <pic:cNvPr id="0" name="03_gerente_dashboard_octubre.png"/>
+                    <pic:cNvPr id="0" name="07_cuentas_confidenciales_gerente.png"/>
                     <pic:cNvPicPr/>
                   </pic:nvPicPr>
                   <pic:blipFill>
-                    <a:blip r:embed="rId11"/>
+                    <a:blip r:embed="rId15"/>
                     <a:stretch>
                       <a:fillRect/>
                     </a:stretch>
@@ -8359,7 +8359,7 @@
                     <pic:cNvPicPr/>
                   </pic:nvPicPr>
                   <pic:blipFill>
-                    <a:blip r:embed="rId13"/>
+                    <a:blip r:embed="rId16"/>
                     <a:stretch>
                       <a:fillRect/>
                     </a:stretch>
@@ -8494,7 +8494,7 @@
                     <pic:cNvPicPr/>
                   </pic:nvPicPr>
                   <pic:blipFill>
-                    <a:blip r:embed="rId14"/>
+                    <a:blip r:embed="rId17"/>
                     <a:stretch>
                       <a:fillRect/>
                     </a:stretch>
@@ -8629,7 +8629,7 @@
                     <pic:cNvPicPr/>
                   </pic:nvPicPr>
                   <pic:blipFill>
-                    <a:blip r:embed="rId15"/>
+                    <a:blip r:embed="rId18"/>
                     <a:stretch>
                       <a:fillRect/>
                     </a:stretch>
@@ -8764,7 +8764,7 @@
                     <pic:cNvPicPr/>
                   </pic:nvPicPr>
                   <pic:blipFill>
-                    <a:blip r:embed="rId16"/>
+                    <a:blip r:embed="rId19"/>
                     <a:stretch>
                       <a:fillRect/>
                     </a:stretch>
@@ -8899,7 +8899,7 @@
                     <pic:cNvPicPr/>
                   </pic:nvPicPr>
                   <pic:blipFill>
-                    <a:blip r:embed="rId17"/>
+                    <a:blip r:embed="rId20"/>
                     <a:stretch>
                       <a:fillRect/>
                     </a:stretch>
@@ -9034,7 +9034,7 @@
                     <pic:cNvPicPr/>
                   </pic:nvPicPr>
                   <pic:blipFill>
-                    <a:blip r:embed="rId18"/>
+                    <a:blip r:embed="rId21"/>
                     <a:stretch>
                       <a:fillRect/>
                     </a:stretch>
@@ -9177,7 +9177,7 @@
                     <pic:cNvPicPr/>
                   </pic:nvPicPr>
                   <pic:blipFill>
-                    <a:blip r:embed="rId19"/>
+                    <a:blip r:embed="rId22"/>
                     <a:stretch>
                       <a:fillRect/>
                     </a:stretch>
@@ -9312,7 +9312,7 @@
                     <pic:cNvPicPr/>
                   </pic:nvPicPr>
                   <pic:blipFill>
-                    <a:blip r:embed="rId20"/>
+                    <a:blip r:embed="rId23"/>
                     <a:stretch>
                       <a:fillRect/>
                     </a:stretch>
@@ -9447,7 +9447,7 @@
                     <pic:cNvPicPr/>
                   </pic:nvPicPr>
                   <pic:blipFill>
-                    <a:blip r:embed="rId21"/>
+                    <a:blip r:embed="rId24"/>
                     <a:stretch>
                       <a:fillRect/>
                     </a:stretch>

</xml_diff>

<commit_message>
Implementar 8 observaciones del equipo: N° Operacion, metodos de pago, alerta deudas, validacion 9 digitos Peru, edicion proveedores y pagos, doble boton titular/voucher, cuentas dinamicas y salto de periodo
</commit_message>
<xml_diff>
--- a/docs/entregable_completo_mvp.docx
+++ b/docs/entregable_completo_mvp.docx
@@ -7671,7 +7671,7 @@
       <w:r>
         <w:drawing>
           <wp:inline xmlns:a="http://schemas.openxmlformats.org/drawingml/2006/main" xmlns:pic="http://schemas.openxmlformats.org/drawingml/2006/picture">
-            <wp:extent cx="5212080" cy="7142178"/>
+            <wp:extent cx="5212080" cy="7989141"/>
             <wp:docPr id="3" name="Picture 3"/>
             <wp:cNvGraphicFramePr>
               <a:graphicFrameLocks noChangeAspect="1"/>
@@ -7692,7 +7692,7 @@
                   <pic:spPr>
                     <a:xfrm>
                       <a:off x="0" y="0"/>
-                      <a:ext cx="5212080" cy="7142178"/>
+                      <a:ext cx="5212080" cy="7989141"/>
                     </a:xfrm>
                     <a:prstGeom prst="rect"/>
                   </pic:spPr>
@@ -7806,7 +7806,7 @@
       <w:r>
         <w:drawing>
           <wp:inline xmlns:a="http://schemas.openxmlformats.org/drawingml/2006/main" xmlns:pic="http://schemas.openxmlformats.org/drawingml/2006/picture">
-            <wp:extent cx="5212080" cy="5541907"/>
+            <wp:extent cx="5212080" cy="5855446"/>
             <wp:docPr id="4" name="Picture 4"/>
             <wp:cNvGraphicFramePr>
               <a:graphicFrameLocks noChangeAspect="1"/>
@@ -7827,7 +7827,7 @@
                   <pic:spPr>
                     <a:xfrm>
                       <a:off x="0" y="0"/>
-                      <a:ext cx="5212080" cy="5541907"/>
+                      <a:ext cx="5212080" cy="5855446"/>
                     </a:xfrm>
                     <a:prstGeom prst="rect"/>
                   </pic:spPr>
@@ -7941,7 +7941,7 @@
       <w:r>
         <w:drawing>
           <wp:inline xmlns:a="http://schemas.openxmlformats.org/drawingml/2006/main" xmlns:pic="http://schemas.openxmlformats.org/drawingml/2006/picture">
-            <wp:extent cx="5212080" cy="5607058"/>
+            <wp:extent cx="5212080" cy="5855446"/>
             <wp:docPr id="5" name="Picture 5"/>
             <wp:cNvGraphicFramePr>
               <a:graphicFrameLocks noChangeAspect="1"/>
@@ -7962,7 +7962,7 @@
                   <pic:spPr>
                     <a:xfrm>
                       <a:off x="0" y="0"/>
-                      <a:ext cx="5212080" cy="5607058"/>
+                      <a:ext cx="5212080" cy="5855446"/>
                     </a:xfrm>
                     <a:prstGeom prst="rect"/>
                   </pic:spPr>
@@ -8291,7 +8291,7 @@
           <w:color w:val="D97706"/>
           <w:sz w:val="23"/>
         </w:rPr>
-        <w:t xml:space="preserve">[Paso 8] </w:t>
+        <w:t xml:space="preserve">[Paso 7b] </w:t>
       </w:r>
       <w:r>
         <w:rPr>
@@ -8300,7 +8300,7 @@
           <w:color w:val="1E3A5F"/>
           <w:sz w:val="23"/>
         </w:rPr>
-        <w:t>Gobierno por Gerencia: Registro de Proveedor con Billetera Digital Yape (HU-04, Criterio 4.1)</w:t>
+        <w:t>Registro Dinámico de Cuentas y Tarjetas Bancarias del Gerente (Observación Cuentas)</w:t>
       </w:r>
     </w:p>
     <w:p>
@@ -8322,7 +8322,7 @@
           <w:color w:val="1E3A5F"/>
           <w:sz w:val="18"/>
         </w:rPr>
-        <w:t>HU-04: Gobierno de Proveedores y Tipos de Gasto por Gerencia</w:t>
+        <w:t>HU-02: Administración de Instrumentos Bancarios de Gerencia</w:t>
       </w:r>
     </w:p>
     <w:p>
@@ -8335,7 +8335,7 @@
           <w:color w:val="1F2937"/>
           <w:sz w:val="18"/>
         </w:rPr>
-        <w:t>Formulario exclusivo de Gerencia para dar de alta acreedores. Permite activar la casilla Yape, ingresando el número celular y el nombre del titular/alias para que el asistente cuente con la información oficial.</w:t>
+        <w:t>El Gerente cuenta con el botón 'Nueva Cuenta / Tarjeta' para registrar entidades financieras (BCP, BBVA, Scotiabank, Interbank), tipo de instrumento (Cuenta Corriente, Ahorros, Tarjeta Débito/Crédito), titular, número enmascarado y moneda (PEN/USD).</w:t>
       </w:r>
     </w:p>
     <w:p>
@@ -8355,7 +8355,7 @@
               <a:graphicData uri="http://schemas.openxmlformats.org/drawingml/2006/picture">
                 <pic:pic>
                   <pic:nvPicPr>
-                    <pic:cNvPr id="0" name="08_modal_nuevo_proveedor_yape.png"/>
+                    <pic:cNvPr id="0" name="07b_modal_nueva_cuenta_tarjeta.png"/>
                     <pic:cNvPicPr/>
                   </pic:nvPicPr>
                   <pic:blipFill>
@@ -8390,7 +8390,7 @@
           <w:color w:val="64748B"/>
           <w:sz w:val="16"/>
         </w:rPr>
-        <w:t>Figura: Captura de pantalla del sistema (08_modal_nuevo_proveedor_yape.png)</w:t>
+        <w:t>Figura: Captura de pantalla del sistema (07b_modal_nueva_cuenta_tarjeta.png)</w:t>
       </w:r>
     </w:p>
     <w:p>
@@ -8412,7 +8412,7 @@
           <w:color w:val="0F5132"/>
           <w:sz w:val="17"/>
         </w:rPr>
-        <w:t>Cumple Criterio 4.1: Registro centralizado de acreedores y configuración de billeteras digitales.</w:t>
+        <w:t>Cumple Requerimiento: Registro dinámico y gestión de medios de pago bancarios por Gerencia.</w:t>
       </w:r>
     </w:p>
     <w:p>
@@ -8426,7 +8426,7 @@
           <w:color w:val="D97706"/>
           <w:sz w:val="23"/>
         </w:rPr>
-        <w:t xml:space="preserve">[Paso 9] </w:t>
+        <w:t xml:space="preserve">[Paso 8] </w:t>
       </w:r>
       <w:r>
         <w:rPr>
@@ -8435,7 +8435,7 @@
           <w:color w:val="1E3A5F"/>
           <w:sz w:val="23"/>
         </w:rPr>
-        <w:t>Gobierno por Gerencia: Creación de Nuevos Tipos de Gasto (HU-04, Criterio 4.2)</w:t>
+        <w:t>Gobierno por Gerencia: Registro de Proveedor y Validación Estricta de Teléfono en Perú (HU-04, Criterio 4.1)</w:t>
       </w:r>
     </w:p>
     <w:p>
@@ -8470,7 +8470,7 @@
           <w:color w:val="1F2937"/>
           <w:sz w:val="18"/>
         </w:rPr>
-        <w:t>El Gerente puede dar de alta nuevas categorías de gasto según el rubro de la empresa. En el modal se muestra la lista actual y permite agregar nuevos tipos como 'Seguros Empresariales'.</w:t>
+        <w:t>Formulario exclusivo de Gerencia para dar de alta acreedores. Se incluye validación estricta para teléfonos peruanos: únicamente se admiten números y exactamente 9 dígitos, bloqueando caracteres alfabéticos.</w:t>
       </w:r>
     </w:p>
     <w:p>
@@ -8490,7 +8490,7 @@
               <a:graphicData uri="http://schemas.openxmlformats.org/drawingml/2006/picture">
                 <pic:pic>
                   <pic:nvPicPr>
-                    <pic:cNvPr id="0" name="09_modal_nuevo_tipo_gasto.png"/>
+                    <pic:cNvPr id="0" name="08_modal_nuevo_proveedor_yape.png"/>
                     <pic:cNvPicPr/>
                   </pic:nvPicPr>
                   <pic:blipFill>
@@ -8525,7 +8525,7 @@
           <w:color w:val="64748B"/>
           <w:sz w:val="16"/>
         </w:rPr>
-        <w:t>Figura: Captura de pantalla del sistema (09_modal_nuevo_tipo_gasto.png)</w:t>
+        <w:t>Figura: Captura de pantalla del sistema (08_modal_nuevo_proveedor_yape.png)</w:t>
       </w:r>
     </w:p>
     <w:p>
@@ -8547,7 +8547,7 @@
           <w:color w:val="0F5132"/>
           <w:sz w:val="17"/>
         </w:rPr>
-        <w:t>Cumple Criterio 4.2: Categorización dinámica y estandarizada de gastos definida por gerencia.</w:t>
+        <w:t>Cumple Criterio 4.1 y Validación Perú: Teléfono y número de Yape limitados a exactamente 9 dígitos numéricos.</w:t>
       </w:r>
     </w:p>
     <w:p>
@@ -8561,7 +8561,7 @@
           <w:color w:val="D97706"/>
           <w:sz w:val="23"/>
         </w:rPr>
-        <w:t xml:space="preserve">[Paso 10] </w:t>
+        <w:t xml:space="preserve">[Paso 9] </w:t>
       </w:r>
       <w:r>
         <w:rPr>
@@ -8570,7 +8570,7 @@
           <w:color w:val="1E3A5F"/>
           <w:sz w:val="23"/>
         </w:rPr>
-        <w:t>Catálogo Consolidado de Proveedores Registrados (HU-04, Criterio 4.3)</w:t>
+        <w:t>Gobierno por Gerencia: Creación de Nuevos Tipos de Gasto (HU-04, Criterio 4.2)</w:t>
       </w:r>
     </w:p>
     <w:p>
@@ -8605,7 +8605,7 @@
           <w:color w:val="1F2937"/>
           <w:sz w:val="18"/>
         </w:rPr>
-        <w:t>Directorio autorizado donde se detalla el RUC, razón social, rubro, contacto telefónico y si cuenta con Yape habilitado con su respectivo titular.</w:t>
+        <w:t>El Gerente puede dar de alta nuevas categorías de gasto según el rubro de la empresa. En el modal se muestra la lista actual y permite agregar nuevos tipos como 'Seguros Empresariales'.</w:t>
       </w:r>
     </w:p>
     <w:p>
@@ -8625,7 +8625,7 @@
               <a:graphicData uri="http://schemas.openxmlformats.org/drawingml/2006/picture">
                 <pic:pic>
                   <pic:nvPicPr>
-                    <pic:cNvPr id="0" name="10_catalogo_proveedores.png"/>
+                    <pic:cNvPr id="0" name="09_modal_nuevo_tipo_gasto.png"/>
                     <pic:cNvPicPr/>
                   </pic:nvPicPr>
                   <pic:blipFill>
@@ -8660,7 +8660,7 @@
           <w:color w:val="64748B"/>
           <w:sz w:val="16"/>
         </w:rPr>
-        <w:t>Figura: Captura de pantalla del sistema (10_catalogo_proveedores.png)</w:t>
+        <w:t>Figura: Captura de pantalla del sistema (09_modal_nuevo_tipo_gasto.png)</w:t>
       </w:r>
     </w:p>
     <w:p>
@@ -8682,7 +8682,7 @@
           <w:color w:val="0F5132"/>
           <w:sz w:val="17"/>
         </w:rPr>
-        <w:t>Cumple Criterio 4.3: Directorio autorizado y transparente para el equipo administrativo.</w:t>
+        <w:t>Cumple Criterio 4.2: Categorización dinámica y estandarizada de gastos definida por gerencia.</w:t>
       </w:r>
     </w:p>
     <w:p>
@@ -8696,7 +8696,7 @@
           <w:color w:val="D97706"/>
           <w:sz w:val="23"/>
         </w:rPr>
-        <w:t xml:space="preserve">[Paso 11] </w:t>
+        <w:t xml:space="preserve">[Paso 9b] </w:t>
       </w:r>
       <w:r>
         <w:rPr>
@@ -8705,7 +8705,7 @@
           <w:color w:val="1E3A5F"/>
           <w:sz w:val="23"/>
         </w:rPr>
-        <w:t>Consola Operativa del Asistente con Filtros Dinámicos (HU-01, Criterio 1.4)</w:t>
+        <w:t>Habilitación y Gestión de Métodos de Pago por Gerencia (Observación Métodos de Pago)</w:t>
       </w:r>
     </w:p>
     <w:p>
@@ -8727,7 +8727,7 @@
           <w:color w:val="1E3A5F"/>
           <w:sz w:val="18"/>
         </w:rPr>
-        <w:t>HU-01: Autenticación y Control de Acceso por Rol</w:t>
+        <w:t>HU-04 / HU-05: Medios de Pago Habilitados</w:t>
       </w:r>
     </w:p>
     <w:p>
@@ -8740,7 +8740,7 @@
           <w:color w:val="1F2937"/>
           <w:sz w:val="18"/>
         </w:rPr>
-        <w:t>El Asistente inicia sesión y accede a su consola de pagos del mes. Cuenta con filtros por Proveedor, Tipo de Gasto, Estado (Pendiente / Realizado / Todos) y Orden cronológico o por monto.</w:t>
+        <w:t>El Gerente dispone del botón 'Métodos de Pago' para incorporar nuevas modalidades de cancelación (ej. Plin, PagoEfectivo, Tarjeta de Crédito Corporativa). Los métodos agregados se reflejan inmediatamente en el formulario de liquidación del Asistente.</w:t>
       </w:r>
     </w:p>
     <w:p>
@@ -8751,7 +8751,7 @@
       <w:r>
         <w:drawing>
           <wp:inline xmlns:a="http://schemas.openxmlformats.org/drawingml/2006/main" xmlns:pic="http://schemas.openxmlformats.org/drawingml/2006/picture">
-            <wp:extent cx="5212080" cy="8461486"/>
+            <wp:extent cx="5212080" cy="3909060"/>
             <wp:docPr id="11" name="Picture 11"/>
             <wp:cNvGraphicFramePr>
               <a:graphicFrameLocks noChangeAspect="1"/>
@@ -8760,7 +8760,7 @@
               <a:graphicData uri="http://schemas.openxmlformats.org/drawingml/2006/picture">
                 <pic:pic>
                   <pic:nvPicPr>
-                    <pic:cNvPr id="0" name="11_asistente_consola_octubre.png"/>
+                    <pic:cNvPr id="0" name="09b_modal_metodos_pago.png"/>
                     <pic:cNvPicPr/>
                   </pic:nvPicPr>
                   <pic:blipFill>
@@ -8772,7 +8772,7 @@
                   <pic:spPr>
                     <a:xfrm>
                       <a:off x="0" y="0"/>
-                      <a:ext cx="5212080" cy="8461486"/>
+                      <a:ext cx="5212080" cy="3909060"/>
                     </a:xfrm>
                     <a:prstGeom prst="rect"/>
                   </pic:spPr>
@@ -8795,7 +8795,7 @@
           <w:color w:val="64748B"/>
           <w:sz w:val="16"/>
         </w:rPr>
-        <w:t>Figura: Captura de pantalla del sistema (11_asistente_consola_octubre.png)</w:t>
+        <w:t>Figura: Captura de pantalla del sistema (09b_modal_metodos_pago.png)</w:t>
       </w:r>
     </w:p>
     <w:p>
@@ -8817,7 +8817,7 @@
           <w:color w:val="0F5132"/>
           <w:sz w:val="17"/>
         </w:rPr>
-        <w:t>Cumple Criterio 1.4: Espacio de trabajo enfocado y sin distracciones para el asistente.</w:t>
+        <w:t>Cumple Requerimiento: Parametrización dinámica de métodos de pago autorizados por Gerencia.</w:t>
       </w:r>
     </w:p>
     <w:p>
@@ -8831,7 +8831,7 @@
           <w:color w:val="D97706"/>
           <w:sz w:val="23"/>
         </w:rPr>
-        <w:t xml:space="preserve">[Paso 12] </w:t>
+        <w:t xml:space="preserve">[Paso 10] </w:t>
       </w:r>
       <w:r>
         <w:rPr>
@@ -8840,7 +8840,7 @@
           <w:color w:val="1E3A5F"/>
           <w:sz w:val="23"/>
         </w:rPr>
-        <w:t>Registro de Nuevo Gasto con Identificador Oficial de Recibo (HU-03, HU-04, Criterios 3.1, 4.3)</w:t>
+        <w:t>Catálogo Consolidado de Proveedores Registrados (HU-04, Criterio 4.3)</w:t>
       </w:r>
     </w:p>
     <w:p>
@@ -8862,7 +8862,7 @@
           <w:color w:val="1E3A5F"/>
           <w:sz w:val="18"/>
         </w:rPr>
-        <w:t>HU-03 / HU-04: Gestión Operativa de Obligaciones</w:t>
+        <w:t>HU-04: Gobierno de Proveedores y Tipos de Gasto por Gerencia</w:t>
       </w:r>
     </w:p>
     <w:p>
@@ -8875,7 +8875,7 @@
           <w:color w:val="1F2937"/>
           <w:sz w:val="18"/>
         </w:rPr>
-        <w:t>Al hacer clic en 'Nuevo Gasto', el Asistente registra una obligación ingresando su número de comprobante oficial. Los selectores de Proveedor y Tipo consumen exclusivamente los datos aprobados por el Gerente.</w:t>
+        <w:t>Directorio autorizado donde se detalla el RUC, razón social, rubro, contacto telefónico (9 dígitos) y estado de Yape con botón 'Editar' para mantenimiento.</w:t>
       </w:r>
     </w:p>
     <w:p>
@@ -8895,7 +8895,7 @@
               <a:graphicData uri="http://schemas.openxmlformats.org/drawingml/2006/picture">
                 <pic:pic>
                   <pic:nvPicPr>
-                    <pic:cNvPr id="0" name="12_modal_asistente_nuevo_gasto.png"/>
+                    <pic:cNvPr id="0" name="10_catalogo_proveedores.png"/>
                     <pic:cNvPicPr/>
                   </pic:nvPicPr>
                   <pic:blipFill>
@@ -8930,7 +8930,7 @@
           <w:color w:val="64748B"/>
           <w:sz w:val="16"/>
         </w:rPr>
-        <w:t>Figura: Captura de pantalla del sistema (12_modal_asistente_nuevo_gasto.png)</w:t>
+        <w:t>Figura: Captura de pantalla del sistema (10_catalogo_proveedores.png)</w:t>
       </w:r>
     </w:p>
     <w:p>
@@ -8952,7 +8952,7 @@
           <w:color w:val="0F5132"/>
           <w:sz w:val="17"/>
         </w:rPr>
-        <w:t>Cumple Criterios 3.1 y 4.3: Código de recibo obligatorio y selección controlada de catálogos.</w:t>
+        <w:t>Cumple Criterio 4.3: Directorio autorizado y transparente para el equipo administrativo.</w:t>
       </w:r>
     </w:p>
     <w:p>
@@ -8966,7 +8966,7 @@
           <w:color w:val="D97706"/>
           <w:sz w:val="23"/>
         </w:rPr>
-        <w:t xml:space="preserve">[Paso 13] </w:t>
+        <w:t xml:space="preserve">[Paso 10b] </w:t>
       </w:r>
       <w:r>
         <w:rPr>
@@ -8975,7 +8975,7 @@
           <w:color w:val="1E3A5F"/>
           <w:sz w:val="23"/>
         </w:rPr>
-        <w:t>Liquidación con Yape: Visualización Automática de Datos de Pago (HU-05, Criterio 5.1)</w:t>
+        <w:t>Edición y Mantenimiento de Proveedores Registrados (Observación Edición Proveedores)</w:t>
       </w:r>
     </w:p>
     <w:p>
@@ -8997,7 +8997,7 @@
           <w:color w:val="1E3A5F"/>
           <w:sz w:val="18"/>
         </w:rPr>
-        <w:t>HU-05: Liquidación de Pagos con Yape, Efectivo y Evidencia Fotográfica</w:t>
+        <w:t>HU-04: Mantenimiento del Directorio de Proveedores</w:t>
       </w:r>
     </w:p>
     <w:p>
@@ -9010,7 +9010,7 @@
           <w:color w:val="1F2937"/>
           <w:sz w:val="18"/>
         </w:rPr>
-        <w:t>Al presionar 'Registrar Pago' sobre la Factura F004-9842 y seleccionar 'Yape (Billetera Digital)', el sistema despliega automáticamente una tarjeta informativa en color lila con los datos registrados por el Gerente: 'Número Celular: 987654321' y 'Titular / Alias: Juan Pérez Ramos / Logística Norte'.</w:t>
+        <w:t>Permite corregir en cualquier momento la información comercial, razón social, teléfonos o configuración de billeteras digitales de los proveedores registrados sin necesidad de eliminarlos ni duplicarlos.</w:t>
       </w:r>
     </w:p>
     <w:p>
@@ -9030,7 +9030,7 @@
               <a:graphicData uri="http://schemas.openxmlformats.org/drawingml/2006/picture">
                 <pic:pic>
                   <pic:nvPicPr>
-                    <pic:cNvPr id="0" name="13_modal_pago_yape_datos.png"/>
+                    <pic:cNvPr id="0" name="10b_modal_editar_proveedor.png"/>
                     <pic:cNvPicPr/>
                   </pic:nvPicPr>
                   <pic:blipFill>
@@ -9065,6 +9065,546 @@
           <w:color w:val="64748B"/>
           <w:sz w:val="16"/>
         </w:rPr>
+        <w:t>Figura: Captura de pantalla del sistema (10b_modal_editar_proveedor.png)</w:t>
+      </w:r>
+    </w:p>
+    <w:p>
+      <w:pPr>
+        <w:spacing w:after="200"/>
+      </w:pPr>
+      <w:r>
+        <w:rPr>
+          <w:rFonts w:ascii="Arial" w:hAnsi="Arial"/>
+          <w:b/>
+          <w:color w:val="0F5132"/>
+          <w:sz w:val="17"/>
+        </w:rPr>
+        <w:t xml:space="preserve">Resultado de Validación: </w:t>
+      </w:r>
+      <w:r>
+        <w:rPr>
+          <w:rFonts w:ascii="Arial" w:hAnsi="Arial"/>
+          <w:color w:val="0F5132"/>
+          <w:sz w:val="17"/>
+        </w:rPr>
+        <w:t>Cumple Requerimiento: Mantenimiento y actualización ágil de datos de proveedores.</w:t>
+      </w:r>
+    </w:p>
+    <w:p>
+      <w:pPr>
+        <w:spacing w:before="240" w:after="40"/>
+      </w:pPr>
+      <w:r>
+        <w:rPr>
+          <w:rFonts w:ascii="Arial" w:hAnsi="Arial"/>
+          <w:b/>
+          <w:color w:val="D97706"/>
+          <w:sz w:val="23"/>
+        </w:rPr>
+        <w:t xml:space="preserve">[Paso 11] </w:t>
+      </w:r>
+      <w:r>
+        <w:rPr>
+          <w:rFonts w:ascii="Arial" w:hAnsi="Arial"/>
+          <w:b/>
+          <w:color w:val="1E3A5F"/>
+          <w:sz w:val="23"/>
+        </w:rPr>
+        <w:t>Consola del Asistente con Alerta de Deudas Anteriores y N° Operación (HU-01, HU-02, Criterios 1.4, 2.1)</w:t>
+      </w:r>
+    </w:p>
+    <w:p>
+      <w:pPr>
+        <w:spacing w:after="60"/>
+      </w:pPr>
+      <w:r>
+        <w:rPr>
+          <w:rFonts w:ascii="Arial" w:hAnsi="Arial"/>
+          <w:b/>
+          <w:color w:val="475569"/>
+          <w:sz w:val="18"/>
+        </w:rPr>
+        <w:t xml:space="preserve">Historia Relacionada: </w:t>
+      </w:r>
+      <w:r>
+        <w:rPr>
+          <w:rFonts w:ascii="Arial" w:hAnsi="Arial"/>
+          <w:color w:val="1E3A5F"/>
+          <w:sz w:val="18"/>
+        </w:rPr>
+        <w:t>HU-01 / HU-02: Consola Operativa y Alertas Financieras</w:t>
+      </w:r>
+    </w:p>
+    <w:p>
+      <w:pPr>
+        <w:spacing w:after="120" w:line="276" w:lineRule="auto"/>
+      </w:pPr>
+      <w:r>
+        <w:rPr>
+          <w:rFonts w:ascii="Arial" w:hAnsi="Arial"/>
+          <w:color w:val="1F2937"/>
+          <w:sz w:val="18"/>
+        </w:rPr>
+        <w:t>El Asistente inicia sesión y visualiza de inmediato un banner destacado de advertencia cuando existen obligaciones vencidas de meses pasados sin pagar, con acceso directo a revisarlas. Además, la tabla incluye la columna 'N° Operación' y filtros multidimensionales.</w:t>
+      </w:r>
+    </w:p>
+    <w:p>
+      <w:pPr>
+        <w:spacing w:before="80" w:after="80"/>
+        <w:jc w:val="center"/>
+      </w:pPr>
+      <w:r>
+        <w:drawing>
+          <wp:inline xmlns:a="http://schemas.openxmlformats.org/drawingml/2006/main" xmlns:pic="http://schemas.openxmlformats.org/drawingml/2006/picture">
+            <wp:extent cx="5212080" cy="8738378"/>
+            <wp:docPr id="14" name="Picture 14"/>
+            <wp:cNvGraphicFramePr>
+              <a:graphicFrameLocks noChangeAspect="1"/>
+            </wp:cNvGraphicFramePr>
+            <a:graphic>
+              <a:graphicData uri="http://schemas.openxmlformats.org/drawingml/2006/picture">
+                <pic:pic>
+                  <pic:nvPicPr>
+                    <pic:cNvPr id="0" name="11_asistente_consola_octubre.png"/>
+                    <pic:cNvPicPr/>
+                  </pic:nvPicPr>
+                  <pic:blipFill>
+                    <a:blip r:embed="rId22"/>
+                    <a:stretch>
+                      <a:fillRect/>
+                    </a:stretch>
+                  </pic:blipFill>
+                  <pic:spPr>
+                    <a:xfrm>
+                      <a:off x="0" y="0"/>
+                      <a:ext cx="5212080" cy="8738378"/>
+                    </a:xfrm>
+                    <a:prstGeom prst="rect"/>
+                  </pic:spPr>
+                </pic:pic>
+              </a:graphicData>
+            </a:graphic>
+          </wp:inline>
+        </w:drawing>
+      </w:r>
+    </w:p>
+    <w:p>
+      <w:pPr>
+        <w:spacing w:after="120"/>
+        <w:jc w:val="center"/>
+      </w:pPr>
+      <w:r>
+        <w:rPr>
+          <w:rFonts w:ascii="Arial" w:hAnsi="Arial"/>
+          <w:i/>
+          <w:color w:val="64748B"/>
+          <w:sz w:val="16"/>
+        </w:rPr>
+        <w:t>Figura: Captura de pantalla del sistema (11_asistente_consola_octubre.png)</w:t>
+      </w:r>
+    </w:p>
+    <w:p>
+      <w:pPr>
+        <w:spacing w:after="200"/>
+      </w:pPr>
+      <w:r>
+        <w:rPr>
+          <w:rFonts w:ascii="Arial" w:hAnsi="Arial"/>
+          <w:b/>
+          <w:color w:val="0F5132"/>
+          <w:sz w:val="17"/>
+        </w:rPr>
+        <w:t xml:space="preserve">Resultado de Validación: </w:t>
+      </w:r>
+      <w:r>
+        <w:rPr>
+          <w:rFonts w:ascii="Arial" w:hAnsi="Arial"/>
+          <w:color w:val="0F5132"/>
+          <w:sz w:val="17"/>
+        </w:rPr>
+        <w:t>Cumple Criterio 1.4 y Observación Alerta: Alerta prominente de deudas de meses pasados y visibilidad de N° Operación.</w:t>
+      </w:r>
+    </w:p>
+    <w:p>
+      <w:pPr>
+        <w:spacing w:before="240" w:after="40"/>
+      </w:pPr>
+      <w:r>
+        <w:rPr>
+          <w:rFonts w:ascii="Arial" w:hAnsi="Arial"/>
+          <w:b/>
+          <w:color w:val="D97706"/>
+          <w:sz w:val="23"/>
+        </w:rPr>
+        <w:t xml:space="preserve">[Paso 11b] </w:t>
+      </w:r>
+      <w:r>
+        <w:rPr>
+          <w:rFonts w:ascii="Arial" w:hAnsi="Arial"/>
+          <w:b/>
+          <w:color w:val="1E3A5F"/>
+          <w:sz w:val="23"/>
+        </w:rPr>
+        <w:t>Salto Rápido a Cualquier Periodo (Mes y Año) (Observación Navegación Temporal)</w:t>
+      </w:r>
+    </w:p>
+    <w:p>
+      <w:pPr>
+        <w:spacing w:after="60"/>
+      </w:pPr>
+      <w:r>
+        <w:rPr>
+          <w:rFonts w:ascii="Arial" w:hAnsi="Arial"/>
+          <w:b/>
+          <w:color w:val="475569"/>
+          <w:sz w:val="18"/>
+        </w:rPr>
+        <w:t xml:space="preserve">Historia Relacionada: </w:t>
+      </w:r>
+      <w:r>
+        <w:rPr>
+          <w:rFonts w:ascii="Arial" w:hAnsi="Arial"/>
+          <w:color w:val="1E3A5F"/>
+          <w:sz w:val="18"/>
+        </w:rPr>
+        <w:t>HU-02: Navegación Temporal Ágil sin Exceso de Clics</w:t>
+      </w:r>
+    </w:p>
+    <w:p>
+      <w:pPr>
+        <w:spacing w:after="120" w:line="276" w:lineRule="auto"/>
+      </w:pPr>
+      <w:r>
+        <w:rPr>
+          <w:rFonts w:ascii="Arial" w:hAnsi="Arial"/>
+          <w:color w:val="1F2937"/>
+          <w:sz w:val="18"/>
+        </w:rPr>
+        <w:t>Mediante el selector directo de Mes y Año situado en la barra de navegación, el usuario puede saltar de inmediato a cualquier periodo histórico o futuro (ej. Septiembre 2026 o años lejanos como 2017) en un solo clic, sin requerir decenas de pulsaciones consecutivas.</w:t>
+      </w:r>
+    </w:p>
+    <w:p>
+      <w:pPr>
+        <w:spacing w:before="80" w:after="80"/>
+        <w:jc w:val="center"/>
+      </w:pPr>
+      <w:r>
+        <w:drawing>
+          <wp:inline xmlns:a="http://schemas.openxmlformats.org/drawingml/2006/main" xmlns:pic="http://schemas.openxmlformats.org/drawingml/2006/picture">
+            <wp:extent cx="5212080" cy="6498812"/>
+            <wp:docPr id="15" name="Picture 15"/>
+            <wp:cNvGraphicFramePr>
+              <a:graphicFrameLocks noChangeAspect="1"/>
+            </wp:cNvGraphicFramePr>
+            <a:graphic>
+              <a:graphicData uri="http://schemas.openxmlformats.org/drawingml/2006/picture">
+                <pic:pic>
+                  <pic:nvPicPr>
+                    <pic:cNvPr id="0" name="11b_salto_periodo_rapido.png"/>
+                    <pic:cNvPicPr/>
+                  </pic:nvPicPr>
+                  <pic:blipFill>
+                    <a:blip r:embed="rId23"/>
+                    <a:stretch>
+                      <a:fillRect/>
+                    </a:stretch>
+                  </pic:blipFill>
+                  <pic:spPr>
+                    <a:xfrm>
+                      <a:off x="0" y="0"/>
+                      <a:ext cx="5212080" cy="6498812"/>
+                    </a:xfrm>
+                    <a:prstGeom prst="rect"/>
+                  </pic:spPr>
+                </pic:pic>
+              </a:graphicData>
+            </a:graphic>
+          </wp:inline>
+        </w:drawing>
+      </w:r>
+    </w:p>
+    <w:p>
+      <w:pPr>
+        <w:spacing w:after="120"/>
+        <w:jc w:val="center"/>
+      </w:pPr>
+      <w:r>
+        <w:rPr>
+          <w:rFonts w:ascii="Arial" w:hAnsi="Arial"/>
+          <w:i/>
+          <w:color w:val="64748B"/>
+          <w:sz w:val="16"/>
+        </w:rPr>
+        <w:t>Figura: Captura de pantalla del sistema (11b_salto_periodo_rapido.png)</w:t>
+      </w:r>
+    </w:p>
+    <w:p>
+      <w:pPr>
+        <w:spacing w:after="200"/>
+      </w:pPr>
+      <w:r>
+        <w:rPr>
+          <w:rFonts w:ascii="Arial" w:hAnsi="Arial"/>
+          <w:b/>
+          <w:color w:val="0F5132"/>
+          <w:sz w:val="17"/>
+        </w:rPr>
+        <w:t xml:space="preserve">Resultado de Validación: </w:t>
+      </w:r>
+      <w:r>
+        <w:rPr>
+          <w:rFonts w:ascii="Arial" w:hAnsi="Arial"/>
+          <w:color w:val="0F5132"/>
+          <w:sz w:val="17"/>
+        </w:rPr>
+        <w:t>Cumple Requerimiento: Salto directo y ágil a cualquier año y mes especificado.</w:t>
+      </w:r>
+    </w:p>
+    <w:p>
+      <w:pPr>
+        <w:spacing w:before="240" w:after="40"/>
+      </w:pPr>
+      <w:r>
+        <w:rPr>
+          <w:rFonts w:ascii="Arial" w:hAnsi="Arial"/>
+          <w:b/>
+          <w:color w:val="D97706"/>
+          <w:sz w:val="23"/>
+        </w:rPr>
+        <w:t xml:space="preserve">[Paso 12] </w:t>
+      </w:r>
+      <w:r>
+        <w:rPr>
+          <w:rFonts w:ascii="Arial" w:hAnsi="Arial"/>
+          <w:b/>
+          <w:color w:val="1E3A5F"/>
+          <w:sz w:val="23"/>
+        </w:rPr>
+        <w:t>Registro de Nuevo Gasto con Identificador Oficial de Recibo (HU-03, HU-04, Criterios 3.1, 4.3)</w:t>
+      </w:r>
+    </w:p>
+    <w:p>
+      <w:pPr>
+        <w:spacing w:after="60"/>
+      </w:pPr>
+      <w:r>
+        <w:rPr>
+          <w:rFonts w:ascii="Arial" w:hAnsi="Arial"/>
+          <w:b/>
+          <w:color w:val="475569"/>
+          <w:sz w:val="18"/>
+        </w:rPr>
+        <w:t xml:space="preserve">Historia Relacionada: </w:t>
+      </w:r>
+      <w:r>
+        <w:rPr>
+          <w:rFonts w:ascii="Arial" w:hAnsi="Arial"/>
+          <w:color w:val="1E3A5F"/>
+          <w:sz w:val="18"/>
+        </w:rPr>
+        <w:t>HU-03 / HU-04: Gestión Operativa de Obligaciones</w:t>
+      </w:r>
+    </w:p>
+    <w:p>
+      <w:pPr>
+        <w:spacing w:after="120" w:line="276" w:lineRule="auto"/>
+      </w:pPr>
+      <w:r>
+        <w:rPr>
+          <w:rFonts w:ascii="Arial" w:hAnsi="Arial"/>
+          <w:color w:val="1F2937"/>
+          <w:sz w:val="18"/>
+        </w:rPr>
+        <w:t>Al hacer clic en 'Nuevo Gasto', el Asistente registra una obligación ingresando su número de comprobante oficial. Los selectores de Proveedor y Tipo consumen exclusivamente los datos aprobados por el Gerente.</w:t>
+      </w:r>
+    </w:p>
+    <w:p>
+      <w:pPr>
+        <w:spacing w:before="80" w:after="80"/>
+        <w:jc w:val="center"/>
+      </w:pPr>
+      <w:r>
+        <w:drawing>
+          <wp:inline xmlns:a="http://schemas.openxmlformats.org/drawingml/2006/main" xmlns:pic="http://schemas.openxmlformats.org/drawingml/2006/picture">
+            <wp:extent cx="5212080" cy="3909060"/>
+            <wp:docPr id="16" name="Picture 16"/>
+            <wp:cNvGraphicFramePr>
+              <a:graphicFrameLocks noChangeAspect="1"/>
+            </wp:cNvGraphicFramePr>
+            <a:graphic>
+              <a:graphicData uri="http://schemas.openxmlformats.org/drawingml/2006/picture">
+                <pic:pic>
+                  <pic:nvPicPr>
+                    <pic:cNvPr id="0" name="12_modal_asistente_nuevo_gasto.png"/>
+                    <pic:cNvPicPr/>
+                  </pic:nvPicPr>
+                  <pic:blipFill>
+                    <a:blip r:embed="rId24"/>
+                    <a:stretch>
+                      <a:fillRect/>
+                    </a:stretch>
+                  </pic:blipFill>
+                  <pic:spPr>
+                    <a:xfrm>
+                      <a:off x="0" y="0"/>
+                      <a:ext cx="5212080" cy="3909060"/>
+                    </a:xfrm>
+                    <a:prstGeom prst="rect"/>
+                  </pic:spPr>
+                </pic:pic>
+              </a:graphicData>
+            </a:graphic>
+          </wp:inline>
+        </w:drawing>
+      </w:r>
+    </w:p>
+    <w:p>
+      <w:pPr>
+        <w:spacing w:after="120"/>
+        <w:jc w:val="center"/>
+      </w:pPr>
+      <w:r>
+        <w:rPr>
+          <w:rFonts w:ascii="Arial" w:hAnsi="Arial"/>
+          <w:i/>
+          <w:color w:val="64748B"/>
+          <w:sz w:val="16"/>
+        </w:rPr>
+        <w:t>Figura: Captura de pantalla del sistema (12_modal_asistente_nuevo_gasto.png)</w:t>
+      </w:r>
+    </w:p>
+    <w:p>
+      <w:pPr>
+        <w:spacing w:after="200"/>
+      </w:pPr>
+      <w:r>
+        <w:rPr>
+          <w:rFonts w:ascii="Arial" w:hAnsi="Arial"/>
+          <w:b/>
+          <w:color w:val="0F5132"/>
+          <w:sz w:val="17"/>
+        </w:rPr>
+        <w:t xml:space="preserve">Resultado de Validación: </w:t>
+      </w:r>
+      <w:r>
+        <w:rPr>
+          <w:rFonts w:ascii="Arial" w:hAnsi="Arial"/>
+          <w:color w:val="0F5132"/>
+          <w:sz w:val="17"/>
+        </w:rPr>
+        <w:t>Cumple Criterios 3.1 y 4.3: Código de recibo obligatorio y selección controlada de catálogos.</w:t>
+      </w:r>
+    </w:p>
+    <w:p>
+      <w:pPr>
+        <w:spacing w:before="240" w:after="40"/>
+      </w:pPr>
+      <w:r>
+        <w:rPr>
+          <w:rFonts w:ascii="Arial" w:hAnsi="Arial"/>
+          <w:b/>
+          <w:color w:val="D97706"/>
+          <w:sz w:val="23"/>
+        </w:rPr>
+        <w:t xml:space="preserve">[Paso 13] </w:t>
+      </w:r>
+      <w:r>
+        <w:rPr>
+          <w:rFonts w:ascii="Arial" w:hAnsi="Arial"/>
+          <w:b/>
+          <w:color w:val="1E3A5F"/>
+          <w:sz w:val="23"/>
+        </w:rPr>
+        <w:t>Liquidación con Yape: Visualización Automática de Datos de Pago (HU-05, Criterio 5.1)</w:t>
+      </w:r>
+    </w:p>
+    <w:p>
+      <w:pPr>
+        <w:spacing w:after="60"/>
+      </w:pPr>
+      <w:r>
+        <w:rPr>
+          <w:rFonts w:ascii="Arial" w:hAnsi="Arial"/>
+          <w:b/>
+          <w:color w:val="475569"/>
+          <w:sz w:val="18"/>
+        </w:rPr>
+        <w:t xml:space="preserve">Historia Relacionada: </w:t>
+      </w:r>
+      <w:r>
+        <w:rPr>
+          <w:rFonts w:ascii="Arial" w:hAnsi="Arial"/>
+          <w:color w:val="1E3A5F"/>
+          <w:sz w:val="18"/>
+        </w:rPr>
+        <w:t>HU-05: Liquidación de Pagos con Yape, Efectivo y Evidencia Fotográfica</w:t>
+      </w:r>
+    </w:p>
+    <w:p>
+      <w:pPr>
+        <w:spacing w:after="120" w:line="276" w:lineRule="auto"/>
+      </w:pPr>
+      <w:r>
+        <w:rPr>
+          <w:rFonts w:ascii="Arial" w:hAnsi="Arial"/>
+          <w:color w:val="1F2937"/>
+          <w:sz w:val="18"/>
+        </w:rPr>
+        <w:t>Al presionar 'Registrar Pago' sobre la Factura F004-9842 y seleccionar 'Yape (Billetera Digital)', el sistema despliega automáticamente una tarjeta informativa en color lila con los datos registrados por el Gerente: 'Número Celular: 987654321' y 'Titular / Alias: Juan Pérez Ramos / Logística Norte'.</w:t>
+      </w:r>
+    </w:p>
+    <w:p>
+      <w:pPr>
+        <w:spacing w:before="80" w:after="80"/>
+        <w:jc w:val="center"/>
+      </w:pPr>
+      <w:r>
+        <w:drawing>
+          <wp:inline xmlns:a="http://schemas.openxmlformats.org/drawingml/2006/main" xmlns:pic="http://schemas.openxmlformats.org/drawingml/2006/picture">
+            <wp:extent cx="5212080" cy="3909060"/>
+            <wp:docPr id="17" name="Picture 17"/>
+            <wp:cNvGraphicFramePr>
+              <a:graphicFrameLocks noChangeAspect="1"/>
+            </wp:cNvGraphicFramePr>
+            <a:graphic>
+              <a:graphicData uri="http://schemas.openxmlformats.org/drawingml/2006/picture">
+                <pic:pic>
+                  <pic:nvPicPr>
+                    <pic:cNvPr id="0" name="13_modal_pago_yape_datos.png"/>
+                    <pic:cNvPicPr/>
+                  </pic:nvPicPr>
+                  <pic:blipFill>
+                    <a:blip r:embed="rId25"/>
+                    <a:stretch>
+                      <a:fillRect/>
+                    </a:stretch>
+                  </pic:blipFill>
+                  <pic:spPr>
+                    <a:xfrm>
+                      <a:off x="0" y="0"/>
+                      <a:ext cx="5212080" cy="3909060"/>
+                    </a:xfrm>
+                    <a:prstGeom prst="rect"/>
+                  </pic:spPr>
+                </pic:pic>
+              </a:graphicData>
+            </a:graphic>
+          </wp:inline>
+        </w:drawing>
+      </w:r>
+    </w:p>
+    <w:p>
+      <w:pPr>
+        <w:spacing w:after="120"/>
+        <w:jc w:val="center"/>
+      </w:pPr>
+      <w:r>
+        <w:rPr>
+          <w:rFonts w:ascii="Arial" w:hAnsi="Arial"/>
+          <w:i/>
+          <w:color w:val="64748B"/>
+          <w:sz w:val="16"/>
+        </w:rPr>
         <w:t>Figura: Captura de pantalla del sistema (13_modal_pago_yape_datos.png)</w:t>
       </w:r>
     </w:p>
@@ -9165,7 +9705,7 @@
         <w:drawing>
           <wp:inline xmlns:a="http://schemas.openxmlformats.org/drawingml/2006/main" xmlns:pic="http://schemas.openxmlformats.org/drawingml/2006/picture">
             <wp:extent cx="5212080" cy="3909060"/>
-            <wp:docPr id="14" name="Picture 14"/>
+            <wp:docPr id="18" name="Picture 18"/>
             <wp:cNvGraphicFramePr>
               <a:graphicFrameLocks noChangeAspect="1"/>
             </wp:cNvGraphicFramePr>
@@ -9177,7 +9717,7 @@
                     <pic:cNvPicPr/>
                   </pic:nvPicPr>
                   <pic:blipFill>
-                    <a:blip r:embed="rId22"/>
+                    <a:blip r:embed="rId26"/>
                     <a:stretch>
                       <a:fillRect/>
                     </a:stretch>
@@ -9253,7 +9793,7 @@
           <w:color w:val="1E3A5F"/>
           <w:sz w:val="23"/>
         </w:rPr>
-        <w:t>Actualización Inmediata a Estado 'Realizado' (HU-05, Criterio 5.3)</w:t>
+        <w:t>Actualización a Estado 'Realizado', N° de Operación y Visualización Conjunta de Titular y Voucher (HU-05, Criterio 5.3)</w:t>
       </w:r>
     </w:p>
     <w:p>
@@ -9275,7 +9815,7 @@
           <w:color w:val="1E3A5F"/>
           <w:sz w:val="18"/>
         </w:rPr>
-        <w:t>HU-05: Liquidación de Pagos con Yape, Efectivo y Evidencia Fotográfica</w:t>
+        <w:t>HU-05: Liquidación de Pagos y Auditoría Documental Simultánea</w:t>
       </w:r>
     </w:p>
     <w:p>
@@ -9288,7 +9828,7 @@
           <w:color w:val="1F2937"/>
           <w:sz w:val="18"/>
         </w:rPr>
-        <w:t>Al confirmar el pago indicando el método y número de constancia, la obligación pasa al estado 'Realizado' y muestra la fecha y el método empleado. El registro se traslada a la lista de completados del Asistente y actualiza en tiempo real los totales en el Dashboard del Gerente.</w:t>
+        <w:t>Al registrar el pago, se muestra claramente el N° de Operación en la tabla ('OP-9988221'). Además, se mantienen disponibles simultáneamente AMBOS botones: 'Ver Titular / DNI' y 'Ver Voucher', permitiendo auditar tanto la acreditación del recibo propio como el comprobante bancario del pago.</w:t>
       </w:r>
     </w:p>
     <w:p>
@@ -9299,8 +9839,8 @@
       <w:r>
         <w:drawing>
           <wp:inline xmlns:a="http://schemas.openxmlformats.org/drawingml/2006/main" xmlns:pic="http://schemas.openxmlformats.org/drawingml/2006/picture">
-            <wp:extent cx="5212080" cy="8461486"/>
-            <wp:docPr id="15" name="Picture 15"/>
+            <wp:extent cx="5212080" cy="8738378"/>
+            <wp:docPr id="19" name="Picture 19"/>
             <wp:cNvGraphicFramePr>
               <a:graphicFrameLocks noChangeAspect="1"/>
             </wp:cNvGraphicFramePr>
@@ -9312,7 +9852,7 @@
                     <pic:cNvPicPr/>
                   </pic:nvPicPr>
                   <pic:blipFill>
-                    <a:blip r:embed="rId23"/>
+                    <a:blip r:embed="rId27"/>
                     <a:stretch>
                       <a:fillRect/>
                     </a:stretch>
@@ -9320,7 +9860,7 @@
                   <pic:spPr>
                     <a:xfrm>
                       <a:off x="0" y="0"/>
-                      <a:ext cx="5212080" cy="8461486"/>
+                      <a:ext cx="5212080" cy="8738378"/>
                     </a:xfrm>
                     <a:prstGeom prst="rect"/>
                   </pic:spPr>
@@ -9365,7 +9905,142 @@
           <w:color w:val="0F5132"/>
           <w:sz w:val="17"/>
         </w:rPr>
-        <w:t>Cumple Criterio 5.3: Actualización reactiva de estado y sincronización de balance.</w:t>
+        <w:t>Cumple Criterio 5.3 y Observaciones Compañero: N° Operación visible y acceso simultáneo a Titular y Voucher de pago.</w:t>
+      </w:r>
+    </w:p>
+    <w:p>
+      <w:pPr>
+        <w:spacing w:before="240" w:after="40"/>
+      </w:pPr>
+      <w:r>
+        <w:rPr>
+          <w:rFonts w:ascii="Arial" w:hAnsi="Arial"/>
+          <w:b/>
+          <w:color w:val="D97706"/>
+          <w:sz w:val="23"/>
+        </w:rPr>
+        <w:t xml:space="preserve">[Paso 15b] </w:t>
+      </w:r>
+      <w:r>
+        <w:rPr>
+          <w:rFonts w:ascii="Arial" w:hAnsi="Arial"/>
+          <w:b/>
+          <w:color w:val="1E3A5F"/>
+          <w:sz w:val="23"/>
+        </w:rPr>
+        <w:t>Edición y Corrección de Gastos y Pagos por el Asistente (Observación Edición Pagos)</w:t>
+      </w:r>
+    </w:p>
+    <w:p>
+      <w:pPr>
+        <w:spacing w:after="60"/>
+      </w:pPr>
+      <w:r>
+        <w:rPr>
+          <w:rFonts w:ascii="Arial" w:hAnsi="Arial"/>
+          <w:b/>
+          <w:color w:val="475569"/>
+          <w:sz w:val="18"/>
+        </w:rPr>
+        <w:t xml:space="preserve">Historia Relacionada: </w:t>
+      </w:r>
+      <w:r>
+        <w:rPr>
+          <w:rFonts w:ascii="Arial" w:hAnsi="Arial"/>
+          <w:color w:val="1E3A5F"/>
+          <w:sz w:val="18"/>
+        </w:rPr>
+        <w:t>HU-03 / HU-05: Edición y Rectificación Administrativa</w:t>
+      </w:r>
+    </w:p>
+    <w:p>
+      <w:pPr>
+        <w:spacing w:after="120" w:line="276" w:lineRule="auto"/>
+      </w:pPr>
+      <w:r>
+        <w:rPr>
+          <w:rFonts w:ascii="Arial" w:hAnsi="Arial"/>
+          <w:color w:val="1F2937"/>
+          <w:sz w:val="18"/>
+        </w:rPr>
+        <w:t>En caso de error en el importe, descripción, fecha de vencimiento o número de operación ingresado, el Asistente puede hacer clic en 'Editar' para rectificar los datos sin alterar la trazabilidad del sistema.</w:t>
+      </w:r>
+    </w:p>
+    <w:p>
+      <w:pPr>
+        <w:spacing w:before="80" w:after="80"/>
+        <w:jc w:val="center"/>
+      </w:pPr>
+      <w:r>
+        <w:drawing>
+          <wp:inline xmlns:a="http://schemas.openxmlformats.org/drawingml/2006/main" xmlns:pic="http://schemas.openxmlformats.org/drawingml/2006/picture">
+            <wp:extent cx="5212080" cy="3909060"/>
+            <wp:docPr id="20" name="Picture 20"/>
+            <wp:cNvGraphicFramePr>
+              <a:graphicFrameLocks noChangeAspect="1"/>
+            </wp:cNvGraphicFramePr>
+            <a:graphic>
+              <a:graphicData uri="http://schemas.openxmlformats.org/drawingml/2006/picture">
+                <pic:pic>
+                  <pic:nvPicPr>
+                    <pic:cNvPr id="0" name="15b_modal_editar_gasto_asistente.png"/>
+                    <pic:cNvPicPr/>
+                  </pic:nvPicPr>
+                  <pic:blipFill>
+                    <a:blip r:embed="rId28"/>
+                    <a:stretch>
+                      <a:fillRect/>
+                    </a:stretch>
+                  </pic:blipFill>
+                  <pic:spPr>
+                    <a:xfrm>
+                      <a:off x="0" y="0"/>
+                      <a:ext cx="5212080" cy="3909060"/>
+                    </a:xfrm>
+                    <a:prstGeom prst="rect"/>
+                  </pic:spPr>
+                </pic:pic>
+              </a:graphicData>
+            </a:graphic>
+          </wp:inline>
+        </w:drawing>
+      </w:r>
+    </w:p>
+    <w:p>
+      <w:pPr>
+        <w:spacing w:after="120"/>
+        <w:jc w:val="center"/>
+      </w:pPr>
+      <w:r>
+        <w:rPr>
+          <w:rFonts w:ascii="Arial" w:hAnsi="Arial"/>
+          <w:i/>
+          <w:color w:val="64748B"/>
+          <w:sz w:val="16"/>
+        </w:rPr>
+        <w:t>Figura: Captura de pantalla del sistema (15b_modal_editar_gasto_asistente.png)</w:t>
+      </w:r>
+    </w:p>
+    <w:p>
+      <w:pPr>
+        <w:spacing w:after="200"/>
+      </w:pPr>
+      <w:r>
+        <w:rPr>
+          <w:rFonts w:ascii="Arial" w:hAnsi="Arial"/>
+          <w:b/>
+          <w:color w:val="0F5132"/>
+          <w:sz w:val="17"/>
+        </w:rPr>
+        <w:t xml:space="preserve">Resultado de Validación: </w:t>
+      </w:r>
+      <w:r>
+        <w:rPr>
+          <w:rFonts w:ascii="Arial" w:hAnsi="Arial"/>
+          <w:color w:val="0F5132"/>
+          <w:sz w:val="17"/>
+        </w:rPr>
+        <w:t>Cumple Requerimiento: Flexibilidad administrativa para corrección de pagos registrados.</w:t>
       </w:r>
     </w:p>
     <w:p>
@@ -9435,7 +10110,7 @@
         <w:drawing>
           <wp:inline xmlns:a="http://schemas.openxmlformats.org/drawingml/2006/main" xmlns:pic="http://schemas.openxmlformats.org/drawingml/2006/picture">
             <wp:extent cx="5212080" cy="3909060"/>
-            <wp:docPr id="16" name="Picture 16"/>
+            <wp:docPr id="21" name="Picture 21"/>
             <wp:cNvGraphicFramePr>
               <a:graphicFrameLocks noChangeAspect="1"/>
             </wp:cNvGraphicFramePr>
@@ -9447,7 +10122,7 @@
                     <pic:cNvPicPr/>
                   </pic:nvPicPr>
                   <pic:blipFill>
-                    <a:blip r:embed="rId24"/>
+                    <a:blip r:embed="rId29"/>
                     <a:stretch>
                       <a:fillRect/>
                     </a:stretch>

</xml_diff>